<commit_message>
Modul Gaya Belajar: perbaiki gantung Kata Pengantar (muat 1 halaman) + perkaya premium
- Fix blok tanda tangan Kata Pengantar yang gantung sendirian di halaman 2: ringkas KP jadi 4 paragraf padat + signoff break-before:avoid -> KP rapi 1 halaman
- Tambah 3 diagram ORIGINAL (jadi 2 gambar per bab): Gambar 1.2 Faktor yang Memengaruhi Gaya Belajar, Gambar 2.2 Empat Modalitas VARK, Gambar 3.2 Siklus Membangun Kebiasaan Belajar
- Tambah Tabel 3.3 Optimalisasi Lingkungan Belajar Sesuai Gaya Belajar
- Total kini 6 gambar + 7 tabel; 37 halaman (1 cover + 36 isi); QA rubrik 100% PASS
</commit_message>
<xml_diff>
--- a/MODUL_FINAL/Modul Gaya Belajar - Kelompok 10 - BnP - FINAL.docx
+++ b/MODUL_FINAL/Modul Gaya Belajar - Kelompok 10 - BnP - FINAL.docx
@@ -105,23 +105,7 @@
           <w:i w:val="0"/>
           <w:sz w:val="24"/>
         </w:rPr>
-        <w:t>Modul ini disusun sebagai pemenuhan tugas kelompok pada mata kuliah Belajar dan Pembelajaran, Program Studi Bimbingan dan Konseling, Fakultas Ilmu Pendidikan dan Pengetahuan Sosial, Universitas Indraprasta PGRI. Penyusunannya berangkat dari satu kenyataan sederhana, yaitu bahwa setiap mahasiswa memiliki cara belajar yang berbeda, namun belum semua menyadari dan memanfaatkannya.</w:t>
-      </w:r>
-    </w:p>
-    <w:p>
-      <w:pPr>
-        <w:spacing w:lineRule="auto" w:line="360" w:after="160" w:before="0"/>
-        <w:jc w:val="both"/>
-        <w:widowControl w:val="true"/>
-      </w:pPr>
-      <w:r>
-        <w:rPr>
-          <w:rFonts w:ascii="Cambria" w:hAnsi="Cambria" w:eastAsia="Cambria"/>
-          <w:b w:val="0"/>
-          <w:i w:val="0"/>
-          <w:sz w:val="24"/>
-        </w:rPr>
-        <w:t>Belajar merupakan aktivitas yang sangat sentral dalam kehidupan mahasiswa. Pemahaman tentang gaya belajar menjadi penting karena dapat membantu mahasiswa memilih strategi yang paling sesuai dengan karakteristik dirinya, sehingga proses belajar terasa lebih efektif, efisien, dan menyenangkan. Modul ini dirancang untuk membantu mahasiswa, khususnya mahasiswa semester awal, dalam memahami konsep gaya belajar, mengenali tipenya, serta menerapkan strategi yang tepat.</w:t>
+        <w:t>Modul ini disusun untuk memenuhi tugas kelompok pada mata kuliah Belajar dan Pembelajaran, Program Studi Bimbingan dan Konseling, Fakultas Ilmu Pendidikan dan Pengetahuan Sosial, Universitas Indraprasta PGRI. Penyusunannya berangkat dari satu kenyataan sederhana, yaitu bahwa setiap mahasiswa memiliki cara belajar yang berbeda, namun belum semua menyadari dan memanfaatkannya. Pemahaman tentang gaya belajar membantu mahasiswa memilih strategi yang paling sesuai dengan dirinya, sehingga proses belajar terasa lebih efektif, efisien, dan menyenangkan.</w:t>
       </w:r>
     </w:p>
     <w:p>
@@ -235,7 +219,7 @@
         </w:rPr>
         <w:t>Daftar Tabel</w:t>
         <w:tab/>
-        <w:t>5</w:t>
+        <w:t>4</w:t>
       </w:r>
     </w:p>
     <w:p>
@@ -255,7 +239,7 @@
         </w:rPr>
         <w:t>Daftar Gambar</w:t>
         <w:tab/>
-        <w:t>6</w:t>
+        <w:t>5</w:t>
       </w:r>
     </w:p>
     <w:p>
@@ -275,7 +259,7 @@
         </w:rPr>
         <w:t>Pendahuluan</w:t>
         <w:tab/>
-        <w:t>7</w:t>
+        <w:t>6</w:t>
       </w:r>
     </w:p>
     <w:p>
@@ -296,7 +280,7 @@
         </w:rPr>
         <w:t>BAB I  MEMAHAMI KONSEP DAN TEORI GAYA BELAJAR</w:t>
         <w:tab/>
-        <w:t>9</w:t>
+        <w:t>8</w:t>
       </w:r>
     </w:p>
     <w:p>
@@ -317,7 +301,7 @@
         </w:rPr>
         <w:t>1.1 Pengertian Gaya Belajar</w:t>
         <w:tab/>
-        <w:t>9</w:t>
+        <w:t>8</w:t>
       </w:r>
     </w:p>
     <w:p>
@@ -338,7 +322,7 @@
         </w:rPr>
         <w:t>1.2 Hakikat dan Karakteristik Gaya Belajar</w:t>
         <w:tab/>
-        <w:t>10</w:t>
+        <w:t>9</w:t>
       </w:r>
     </w:p>
     <w:p>
@@ -359,7 +343,7 @@
         </w:rPr>
         <w:t>1.3 Teori-Teori Gaya Belajar</w:t>
         <w:tab/>
-        <w:t>10</w:t>
+        <w:t>9</w:t>
       </w:r>
     </w:p>
     <w:p>
@@ -380,7 +364,7 @@
         </w:rPr>
         <w:t>1.4 Pentingnya Memahami Gaya Belajar bagi Mahasiswa</w:t>
         <w:tab/>
-        <w:t>11</w:t>
+        <w:t>10</w:t>
       </w:r>
     </w:p>
     <w:p>
@@ -401,7 +385,7 @@
         </w:rPr>
         <w:t>1.5 Hubungan Gaya Belajar dengan Keberhasilan Akademik</w:t>
         <w:tab/>
-        <w:t>11</w:t>
+        <w:t>10</w:t>
       </w:r>
     </w:p>
     <w:p>
@@ -422,7 +406,7 @@
         </w:rPr>
         <w:t>1.6 Faktor-Faktor yang Memengaruhi Gaya Belajar</w:t>
         <w:tab/>
-        <w:t>13</w:t>
+        <w:t>12</w:t>
       </w:r>
     </w:p>
     <w:p>
@@ -443,7 +427,7 @@
         </w:rPr>
         <w:t>1.7 Mitos dan Fakta tentang Gaya Belajar</w:t>
         <w:tab/>
-        <w:t>14</w:t>
+        <w:t>13</w:t>
       </w:r>
     </w:p>
     <w:p>
@@ -464,7 +448,7 @@
         </w:rPr>
         <w:t>1.8 Perkembangan Studi Gaya Belajar</w:t>
         <w:tab/>
-        <w:t>14</w:t>
+        <w:t>13</w:t>
       </w:r>
     </w:p>
     <w:p>
@@ -485,7 +469,7 @@
         </w:rPr>
         <w:t>1.9 Implikasi Gaya Belajar bagi Praktik Pembelajaran</w:t>
         <w:tab/>
-        <w:t>15</w:t>
+        <w:t>14</w:t>
       </w:r>
     </w:p>
     <w:p>
@@ -506,7 +490,7 @@
         </w:rPr>
         <w:t>BAB II  MENGENAL TIGA TIPE GAYA BELAJAR (VAK)</w:t>
         <w:tab/>
-        <w:t>16</w:t>
+        <w:t>15</w:t>
       </w:r>
     </w:p>
     <w:p>
@@ -527,7 +511,7 @@
         </w:rPr>
         <w:t>2.1 Model VAK dari Neil Fleming</w:t>
         <w:tab/>
-        <w:t>16</w:t>
+        <w:t>15</w:t>
       </w:r>
     </w:p>
     <w:p>
@@ -548,7 +532,7 @@
         </w:rPr>
         <w:t>2.2 Gaya Belajar Visual</w:t>
         <w:tab/>
-        <w:t>17</w:t>
+        <w:t>16</w:t>
       </w:r>
     </w:p>
     <w:p>
@@ -569,7 +553,7 @@
         </w:rPr>
         <w:t>2.3 Gaya Belajar Auditorial</w:t>
         <w:tab/>
-        <w:t>17</w:t>
+        <w:t>16</w:t>
       </w:r>
     </w:p>
     <w:p>
@@ -590,7 +574,7 @@
         </w:rPr>
         <w:t>2.4 Gaya Belajar Kinestetik</w:t>
         <w:tab/>
-        <w:t>18</w:t>
+        <w:t>17</w:t>
       </w:r>
     </w:p>
     <w:p>
@@ -611,7 +595,7 @@
         </w:rPr>
         <w:t>2.5 Cara Mengidentifikasi Gaya Belajar Diri</w:t>
         <w:tab/>
-        <w:t>19</w:t>
+        <w:t>18</w:t>
       </w:r>
     </w:p>
     <w:p>
@@ -632,7 +616,7 @@
         </w:rPr>
         <w:t>2.6 Gaya Belajar Multimodal</w:t>
         <w:tab/>
-        <w:t>20</w:t>
+        <w:t>19</w:t>
       </w:r>
     </w:p>
     <w:p>
@@ -653,7 +637,7 @@
         </w:rPr>
         <w:t>2.7 Tipe Read/Write dalam Model VARK</w:t>
         <w:tab/>
-        <w:t>21</w:t>
+        <w:t>20</w:t>
       </w:r>
     </w:p>
     <w:p>
@@ -674,7 +658,7 @@
         </w:rPr>
         <w:t>2.8 Studi Kasus: Gaya Belajar di Lingkungan Kampus</w:t>
         <w:tab/>
-        <w:t>22</w:t>
+        <w:t>21</w:t>
       </w:r>
     </w:p>
     <w:p>
@@ -947,7 +931,7 @@
         </w:rPr>
         <w:t>Refleksi</w:t>
         <w:tab/>
-        <w:t>30</w:t>
+        <w:t>31</w:t>
       </w:r>
     </w:p>
     <w:p>
@@ -968,7 +952,7 @@
         </w:rPr>
         <w:t>Evaluasi</w:t>
         <w:tab/>
-        <w:t>31</w:t>
+        <w:t>32</w:t>
       </w:r>
     </w:p>
     <w:p>
@@ -989,7 +973,7 @@
         </w:rPr>
         <w:t>Daftar Pustaka</w:t>
         <w:tab/>
-        <w:t>34</w:t>
+        <w:t>35</w:t>
       </w:r>
     </w:p>
     <w:p>
@@ -1010,7 +994,7 @@
         </w:rPr>
         <w:t>Penutup</w:t>
         <w:tab/>
-        <w:t>35</w:t>
+        <w:t>36</w:t>
       </w:r>
     </w:p>
     <w:p>
@@ -1052,7 +1036,7 @@
         </w:rPr>
         <w:t>Tabel 1.1  Perbandingan Teori Gaya Belajar</w:t>
         <w:tab/>
-        <w:t>10</w:t>
+        <w:t>9</w:t>
       </w:r>
     </w:p>
     <w:p>
@@ -1072,7 +1056,7 @@
         </w:rPr>
         <w:t>Tabel 2.1  Karakteristik Tiga Tipe Gaya Belajar</w:t>
         <w:tab/>
-        <w:t>18</w:t>
+        <w:t>17</w:t>
       </w:r>
     </w:p>
     <w:p>
@@ -1092,7 +1076,7 @@
         </w:rPr>
         <w:t>Tabel 2.2  Panduan Mengidentifikasi Gaya Belajar Diri</w:t>
         <w:tab/>
-        <w:t>19</w:t>
+        <w:t>18</w:t>
       </w:r>
     </w:p>
     <w:p>
@@ -1112,7 +1096,7 @@
         </w:rPr>
         <w:t>Tabel 2.3  Perbandingan Empat Tipe Gaya Belajar VARK</w:t>
         <w:tab/>
-        <w:t>21</w:t>
+        <w:t>20</w:t>
       </w:r>
     </w:p>
     <w:p>
@@ -1157,6 +1141,26 @@
     </w:p>
     <w:p>
       <w:pPr>
+        <w:tabs>
+          <w:tab w:pos="7937" w:val="right" w:leader="dot"/>
+        </w:tabs>
+        <w:spacing w:lineRule="auto" w:line="300" w:after="40" w:before="20"/>
+        <w:widowControl w:val="true"/>
+      </w:pPr>
+      <w:r>
+        <w:rPr>
+          <w:rFonts w:ascii="Cambria" w:hAnsi="Cambria" w:eastAsia="Cambria"/>
+          <w:b w:val="0"/>
+          <w:i w:val="0"/>
+          <w:sz w:val="23"/>
+        </w:rPr>
+        <w:t>Tabel 3.3  Optimalisasi Lingkungan Belajar Sesuai Gaya Belajar</w:t>
+        <w:tab/>
+        <w:t>28</w:t>
+      </w:r>
+    </w:p>
+    <w:p>
+      <w:pPr>
         <w:keepNext/>
         <w:pageBreakBefore/>
         <w:spacing w:lineRule="auto" w:line="360" w:after="280"/>
@@ -1194,7 +1198,27 @@
         </w:rPr>
         <w:t>Gambar 1.1  Skema Proses Belajar Berdasarkan Gaya Belajar</w:t>
         <w:tab/>
-        <w:t>12</w:t>
+        <w:t>11</w:t>
+      </w:r>
+    </w:p>
+    <w:p>
+      <w:pPr>
+        <w:tabs>
+          <w:tab w:pos="7937" w:val="right" w:leader="dot"/>
+        </w:tabs>
+        <w:spacing w:lineRule="auto" w:line="300" w:after="40" w:before="20"/>
+        <w:widowControl w:val="true"/>
+      </w:pPr>
+      <w:r>
+        <w:rPr>
+          <w:rFonts w:ascii="Cambria" w:hAnsi="Cambria" w:eastAsia="Cambria"/>
+          <w:b w:val="0"/>
+          <w:i w:val="0"/>
+          <w:sz w:val="23"/>
+        </w:rPr>
+        <w:t>Gambar 1.2  Faktor yang Memengaruhi Gaya Belajar</w:t>
+        <w:tab/>
+        <w:t>13</w:t>
       </w:r>
     </w:p>
     <w:p>
@@ -1214,7 +1238,27 @@
         </w:rPr>
         <w:t>Gambar 2.1  Ilustrasi Tiga Tipe Gaya Belajar (VAK)</w:t>
         <w:tab/>
-        <w:t>16</w:t>
+        <w:t>15</w:t>
+      </w:r>
+    </w:p>
+    <w:p>
+      <w:pPr>
+        <w:tabs>
+          <w:tab w:pos="7937" w:val="right" w:leader="dot"/>
+        </w:tabs>
+        <w:spacing w:lineRule="auto" w:line="300" w:after="40" w:before="20"/>
+        <w:widowControl w:val="true"/>
+      </w:pPr>
+      <w:r>
+        <w:rPr>
+          <w:rFonts w:ascii="Cambria" w:hAnsi="Cambria" w:eastAsia="Cambria"/>
+          <w:b w:val="0"/>
+          <w:i w:val="0"/>
+          <w:sz w:val="23"/>
+        </w:rPr>
+        <w:t>Gambar 2.2  Empat Modalitas Gaya Belajar VARK</w:t>
+        <w:tab/>
+        <w:t>20</w:t>
       </w:r>
     </w:p>
     <w:p>
@@ -1235,6 +1279,26 @@
         <w:t>Gambar 3.1  Diagram Pemilihan Strategi Belajar</w:t>
         <w:tab/>
         <w:t>26</w:t>
+      </w:r>
+    </w:p>
+    <w:p>
+      <w:pPr>
+        <w:tabs>
+          <w:tab w:pos="7937" w:val="right" w:leader="dot"/>
+        </w:tabs>
+        <w:spacing w:lineRule="auto" w:line="300" w:after="40" w:before="20"/>
+        <w:widowControl w:val="true"/>
+      </w:pPr>
+      <w:r>
+        <w:rPr>
+          <w:rFonts w:ascii="Cambria" w:hAnsi="Cambria" w:eastAsia="Cambria"/>
+          <w:b w:val="0"/>
+          <w:i w:val="0"/>
+          <w:sz w:val="23"/>
+        </w:rPr>
+        <w:t>Gambar 3.2  Siklus Membangun Kebiasaan Belajar</w:t>
+        <w:tab/>
+        <w:t>29</w:t>
       </w:r>
     </w:p>
     <w:p>
@@ -2902,6 +2966,98 @@
     </w:p>
     <w:p>
       <w:pPr>
+        <w:spacing w:lineRule="auto" w:line="360" w:after="160" w:before="0"/>
+        <w:jc w:val="both"/>
+        <w:widowControl w:val="true"/>
+      </w:pPr>
+      <w:r>
+        <w:rPr>
+          <w:rFonts w:ascii="Cambria" w:hAnsi="Cambria" w:eastAsia="Cambria"/>
+          <w:b w:val="0"/>
+          <w:i w:val="0"/>
+          <w:sz w:val="24"/>
+        </w:rPr>
+        <w:t>Kelima faktor tersebut diringkas pada Gambar 1.2 berikut agar lebih mudah diingat.</w:t>
+      </w:r>
+    </w:p>
+    <w:p>
+      <w:pPr>
+        <w:keepNext/>
+        <w:spacing w:before="120" w:after="60"/>
+        <w:jc w:val="center"/>
+      </w:pPr>
+      <w:r>
+        <w:drawing>
+          <wp:inline xmlns:a="http://schemas.openxmlformats.org/drawingml/2006/main" xmlns:pic="http://schemas.openxmlformats.org/drawingml/2006/picture">
+            <wp:extent cx="5220000" cy="1159591"/>
+            <wp:docPr id="3" name="Picture 3"/>
+            <wp:cNvGraphicFramePr>
+              <a:graphicFrameLocks noChangeAspect="1"/>
+            </wp:cNvGraphicFramePr>
+            <a:graphic>
+              <a:graphicData uri="http://schemas.openxmlformats.org/drawingml/2006/picture">
+                <pic:pic>
+                  <pic:nvPicPr>
+                    <pic:cNvPr id="0" name="fig_1_2.png"/>
+                    <pic:cNvPicPr/>
+                  </pic:nvPicPr>
+                  <pic:blipFill>
+                    <a:blip r:embed="rId15"/>
+                    <a:stretch>
+                      <a:fillRect/>
+                    </a:stretch>
+                  </pic:blipFill>
+                  <pic:spPr>
+                    <a:xfrm>
+                      <a:off x="0" y="0"/>
+                      <a:ext cx="5220000" cy="1159591"/>
+                    </a:xfrm>
+                    <a:prstGeom prst="rect"/>
+                  </pic:spPr>
+                </pic:pic>
+              </a:graphicData>
+            </a:graphic>
+          </wp:inline>
+        </w:drawing>
+      </w:r>
+    </w:p>
+    <w:p>
+      <w:pPr>
+        <w:keepNext/>
+        <w:spacing w:lineRule="auto" w:line="288" w:after="40"/>
+        <w:jc w:val="center"/>
+        <w:widowControl w:val="true"/>
+      </w:pPr>
+      <w:r>
+        <w:rPr>
+          <w:rFonts w:ascii="Cambria" w:hAnsi="Cambria" w:eastAsia="Cambria"/>
+          <w:b/>
+          <w:i w:val="0"/>
+          <w:color w:val="1F3C88"/>
+          <w:sz w:val="22"/>
+        </w:rPr>
+        <w:t>Gambar 1.2  Faktor yang Memengaruhi Gaya Belajar</w:t>
+      </w:r>
+    </w:p>
+    <w:p>
+      <w:pPr>
+        <w:spacing w:lineRule="auto" w:line="288" w:after="180"/>
+        <w:jc w:val="center"/>
+        <w:widowControl w:val="true"/>
+      </w:pPr>
+      <w:r>
+        <w:rPr>
+          <w:rFonts w:ascii="Cambria" w:hAnsi="Cambria" w:eastAsia="Cambria"/>
+          <w:b w:val="0"/>
+          <w:i/>
+          <w:color w:val="5A6477"/>
+          <w:sz w:val="19"/>
+        </w:rPr>
+        <w:t>Sumber: Diolah penulis dari Schunk (2020) dan Pritchard (2017).</w:t>
+      </w:r>
+    </w:p>
+    <w:p>
+      <w:pPr>
         <w:keepNext/>
         <w:spacing w:lineRule="auto" w:line="360" w:before="220" w:after="100"/>
         <w:widowControl w:val="true"/>
@@ -3379,7 +3535,7 @@
         <w:drawing>
           <wp:inline xmlns:a="http://schemas.openxmlformats.org/drawingml/2006/main" xmlns:pic="http://schemas.openxmlformats.org/drawingml/2006/picture">
             <wp:extent cx="5220000" cy="2087264"/>
-            <wp:docPr id="3" name="Picture 3"/>
+            <wp:docPr id="4" name="Picture 4"/>
             <wp:cNvGraphicFramePr>
               <a:graphicFrameLocks noChangeAspect="1"/>
             </wp:cNvGraphicFramePr>
@@ -3391,7 +3547,7 @@
                     <pic:cNvPicPr/>
                   </pic:nvPicPr>
                   <pic:blipFill>
-                    <a:blip r:embed="rId15"/>
+                    <a:blip r:embed="rId16"/>
                     <a:stretch>
                       <a:fillRect/>
                     </a:stretch>
@@ -4931,7 +5087,83 @@
           <w:i w:val="0"/>
           <w:sz w:val="24"/>
         </w:rPr>
-        <w:t>Karakteristik pembelajar Read/Write antara lain menyukai membaca buku teks dan artikel, mengandalkan catatan tertulis yang rapi, senang menyusun ringkasan dan esai, serta lebih mudah memahami informasi yang tersaji dalam bentuk daftar dan poin. Walaupun model VAK lebih populer, pemahaman tentang tipe Read/Write melengkapi gambaran tentang keragaman gaya belajar. Tabel 2.3 membandingkan keempat tipe VARK.</w:t>
+        <w:t>Karakteristik pembelajar Read/Write antara lain menyukai membaca buku teks dan artikel, mengandalkan catatan tertulis yang rapi, senang menyusun ringkasan dan esai, serta lebih mudah memahami informasi yang tersaji dalam bentuk daftar dan poin. Walaupun model VAK lebih populer, pemahaman tentang tipe Read/Write melengkapi gambaran tentang keragaman gaya belajar. Gambar 2.2 dan Tabel 2.3 berikut merangkum keempat modalitas VARK.</w:t>
+      </w:r>
+    </w:p>
+    <w:p>
+      <w:pPr>
+        <w:keepNext/>
+        <w:spacing w:before="120" w:after="60"/>
+        <w:jc w:val="center"/>
+      </w:pPr>
+      <w:r>
+        <w:drawing>
+          <wp:inline xmlns:a="http://schemas.openxmlformats.org/drawingml/2006/main" xmlns:pic="http://schemas.openxmlformats.org/drawingml/2006/picture">
+            <wp:extent cx="5220000" cy="1218491"/>
+            <wp:docPr id="5" name="Picture 5"/>
+            <wp:cNvGraphicFramePr>
+              <a:graphicFrameLocks noChangeAspect="1"/>
+            </wp:cNvGraphicFramePr>
+            <a:graphic>
+              <a:graphicData uri="http://schemas.openxmlformats.org/drawingml/2006/picture">
+                <pic:pic>
+                  <pic:nvPicPr>
+                    <pic:cNvPr id="0" name="fig_2_2.png"/>
+                    <pic:cNvPicPr/>
+                  </pic:nvPicPr>
+                  <pic:blipFill>
+                    <a:blip r:embed="rId17"/>
+                    <a:stretch>
+                      <a:fillRect/>
+                    </a:stretch>
+                  </pic:blipFill>
+                  <pic:spPr>
+                    <a:xfrm>
+                      <a:off x="0" y="0"/>
+                      <a:ext cx="5220000" cy="1218491"/>
+                    </a:xfrm>
+                    <a:prstGeom prst="rect"/>
+                  </pic:spPr>
+                </pic:pic>
+              </a:graphicData>
+            </a:graphic>
+          </wp:inline>
+        </w:drawing>
+      </w:r>
+    </w:p>
+    <w:p>
+      <w:pPr>
+        <w:keepNext/>
+        <w:spacing w:lineRule="auto" w:line="288" w:after="40"/>
+        <w:jc w:val="center"/>
+        <w:widowControl w:val="true"/>
+      </w:pPr>
+      <w:r>
+        <w:rPr>
+          <w:rFonts w:ascii="Cambria" w:hAnsi="Cambria" w:eastAsia="Cambria"/>
+          <w:b/>
+          <w:i w:val="0"/>
+          <w:color w:val="1F3C88"/>
+          <w:sz w:val="22"/>
+        </w:rPr>
+        <w:t>Gambar 2.2  Empat Modalitas Gaya Belajar VARK</w:t>
+      </w:r>
+    </w:p>
+    <w:p>
+      <w:pPr>
+        <w:spacing w:lineRule="auto" w:line="288" w:after="180"/>
+        <w:jc w:val="center"/>
+        <w:widowControl w:val="true"/>
+      </w:pPr>
+      <w:r>
+        <w:rPr>
+          <w:rFonts w:ascii="Cambria" w:hAnsi="Cambria" w:eastAsia="Cambria"/>
+          <w:b w:val="0"/>
+          <w:i/>
+          <w:color w:val="5A6477"/>
+          <w:sz w:val="19"/>
+        </w:rPr>
+        <w:t>Sumber: Diolah penulis dari model VARK (Fleming, 1987).</w:t>
       </w:r>
     </w:p>
     <w:p>
@@ -7101,7 +7333,7 @@
         <w:drawing>
           <wp:inline xmlns:a="http://schemas.openxmlformats.org/drawingml/2006/main" xmlns:pic="http://schemas.openxmlformats.org/drawingml/2006/picture">
             <wp:extent cx="5220000" cy="2087264"/>
-            <wp:docPr id="4" name="Picture 4"/>
+            <wp:docPr id="6" name="Picture 6"/>
             <wp:cNvGraphicFramePr>
               <a:graphicFrameLocks noChangeAspect="1"/>
             </wp:cNvGraphicFramePr>
@@ -7113,7 +7345,7 @@
                     <pic:cNvPicPr/>
                   </pic:nvPicPr>
                   <pic:blipFill>
-                    <a:blip r:embed="rId16"/>
+                    <a:blip r:embed="rId18"/>
                     <a:stretch>
                       <a:fillRect/>
                     </a:stretch>
@@ -7411,6 +7643,309 @@
     <w:p>
       <w:pPr>
         <w:keepNext/>
+        <w:spacing w:lineRule="auto" w:line="288" w:before="160" w:after="60"/>
+        <w:widowControl w:val="true"/>
+      </w:pPr>
+      <w:r>
+        <w:rPr>
+          <w:rFonts w:ascii="Cambria" w:hAnsi="Cambria" w:eastAsia="Cambria"/>
+          <w:b/>
+          <w:i w:val="0"/>
+          <w:color w:val="1F3C88"/>
+          <w:sz w:val="22"/>
+        </w:rPr>
+        <w:t>Tabel 3.3  Optimalisasi Lingkungan Belajar Sesuai Gaya Belajar</w:t>
+      </w:r>
+    </w:p>
+    <w:tbl>
+      <w:tblPr>
+        <w:tblStyle w:val="TableGrid"/>
+        <w:tblW w:type="auto" w:w="0"/>
+        <w:jc w:val="center"/>
+        <w:tblLook w:firstColumn="1" w:firstRow="1" w:lastColumn="0" w:lastRow="0" w:noHBand="0" w:noVBand="1" w:val="04A0"/>
+      </w:tblPr>
+      <w:tblGrid>
+        <w:gridCol w:w="2646"/>
+        <w:gridCol w:w="2646"/>
+        <w:gridCol w:w="2646"/>
+      </w:tblGrid>
+      <w:tr>
+        <w:trPr>
+          <w:cantSplit w:val="true"/>
+        </w:trPr>
+        <w:tc>
+          <w:tcPr>
+            <w:tcW w:type="dxa" w:w="2646"/>
+            <w:shd w:val="clear" w:fill="1F3C88"/>
+          </w:tcPr>
+          <w:p>
+            <w:pPr>
+              <w:spacing w:lineRule="auto" w:line="288" w:after="40"/>
+            </w:pPr>
+            <w:r>
+              <w:rPr>
+                <w:rFonts w:ascii="Cambria" w:hAnsi="Cambria" w:eastAsia="Cambria"/>
+                <w:b/>
+                <w:i w:val="0"/>
+                <w:color w:val="FFFFFF"/>
+                <w:sz w:val="21"/>
+              </w:rPr>
+              <w:t>Gaya Belajar</w:t>
+            </w:r>
+          </w:p>
+        </w:tc>
+        <w:tc>
+          <w:tcPr>
+            <w:tcW w:type="dxa" w:w="2646"/>
+            <w:shd w:val="clear" w:fill="1F3C88"/>
+          </w:tcPr>
+          <w:p>
+            <w:pPr>
+              <w:spacing w:lineRule="auto" w:line="288" w:after="40"/>
+            </w:pPr>
+            <w:r>
+              <w:rPr>
+                <w:rFonts w:ascii="Cambria" w:hAnsi="Cambria" w:eastAsia="Cambria"/>
+                <w:b/>
+                <w:i w:val="0"/>
+                <w:color w:val="FFFFFF"/>
+                <w:sz w:val="21"/>
+              </w:rPr>
+              <w:t>Lingkungan yang Mendukung</w:t>
+            </w:r>
+          </w:p>
+        </w:tc>
+        <w:tc>
+          <w:tcPr>
+            <w:tcW w:type="dxa" w:w="2646"/>
+            <w:shd w:val="clear" w:fill="1F3C88"/>
+          </w:tcPr>
+          <w:p>
+            <w:pPr>
+              <w:spacing w:lineRule="auto" w:line="288" w:after="40"/>
+            </w:pPr>
+            <w:r>
+              <w:rPr>
+                <w:rFonts w:ascii="Cambria" w:hAnsi="Cambria" w:eastAsia="Cambria"/>
+                <w:b/>
+                <w:i w:val="0"/>
+                <w:color w:val="FFFFFF"/>
+                <w:sz w:val="21"/>
+              </w:rPr>
+              <w:t>Sebaiknya Dihindari</w:t>
+            </w:r>
+          </w:p>
+        </w:tc>
+      </w:tr>
+      <w:tr>
+        <w:trPr>
+          <w:cantSplit w:val="true"/>
+        </w:trPr>
+        <w:tc>
+          <w:tcPr>
+            <w:tcW w:type="dxa" w:w="2646"/>
+          </w:tcPr>
+          <w:p>
+            <w:pPr>
+              <w:spacing w:lineRule="auto" w:line="300" w:after="40"/>
+            </w:pPr>
+            <w:r>
+              <w:rPr>
+                <w:rFonts w:ascii="Cambria" w:hAnsi="Cambria" w:eastAsia="Cambria"/>
+                <w:b w:val="0"/>
+                <w:i w:val="0"/>
+                <w:sz w:val="21"/>
+              </w:rPr>
+              <w:t>Visual</w:t>
+            </w:r>
+          </w:p>
+        </w:tc>
+        <w:tc>
+          <w:tcPr>
+            <w:tcW w:type="dxa" w:w="2646"/>
+          </w:tcPr>
+          <w:p>
+            <w:pPr>
+              <w:spacing w:lineRule="auto" w:line="300" w:after="40"/>
+            </w:pPr>
+            <w:r>
+              <w:rPr>
+                <w:rFonts w:ascii="Cambria" w:hAnsi="Cambria" w:eastAsia="Cambria"/>
+                <w:b w:val="0"/>
+                <w:i w:val="0"/>
+                <w:sz w:val="21"/>
+              </w:rPr>
+              <w:t>Ruang rapi dan terang, ada papan untuk diagram</w:t>
+            </w:r>
+          </w:p>
+        </w:tc>
+        <w:tc>
+          <w:tcPr>
+            <w:tcW w:type="dxa" w:w="2646"/>
+          </w:tcPr>
+          <w:p>
+            <w:pPr>
+              <w:spacing w:lineRule="auto" w:line="300" w:after="40"/>
+            </w:pPr>
+            <w:r>
+              <w:rPr>
+                <w:rFonts w:ascii="Cambria" w:hAnsi="Cambria" w:eastAsia="Cambria"/>
+                <w:b w:val="0"/>
+                <w:i w:val="0"/>
+                <w:sz w:val="21"/>
+              </w:rPr>
+              <w:t>Tempat berantakan dan minim visual</w:t>
+            </w:r>
+          </w:p>
+        </w:tc>
+      </w:tr>
+      <w:tr>
+        <w:trPr>
+          <w:cantSplit w:val="true"/>
+        </w:trPr>
+        <w:tc>
+          <w:tcPr>
+            <w:tcW w:type="dxa" w:w="2646"/>
+            <w:shd w:val="clear" w:fill="F1F4FB"/>
+          </w:tcPr>
+          <w:p>
+            <w:pPr>
+              <w:spacing w:lineRule="auto" w:line="300" w:after="40"/>
+            </w:pPr>
+            <w:r>
+              <w:rPr>
+                <w:rFonts w:ascii="Cambria" w:hAnsi="Cambria" w:eastAsia="Cambria"/>
+                <w:b w:val="0"/>
+                <w:i w:val="0"/>
+                <w:sz w:val="21"/>
+              </w:rPr>
+              <w:t>Auditorial</w:t>
+            </w:r>
+          </w:p>
+        </w:tc>
+        <w:tc>
+          <w:tcPr>
+            <w:tcW w:type="dxa" w:w="2646"/>
+            <w:shd w:val="clear" w:fill="F1F4FB"/>
+          </w:tcPr>
+          <w:p>
+            <w:pPr>
+              <w:spacing w:lineRule="auto" w:line="300" w:after="40"/>
+            </w:pPr>
+            <w:r>
+              <w:rPr>
+                <w:rFonts w:ascii="Cambria" w:hAnsi="Cambria" w:eastAsia="Cambria"/>
+                <w:b w:val="0"/>
+                <w:i w:val="0"/>
+                <w:sz w:val="21"/>
+              </w:rPr>
+              <w:t>Tempat tenang, boleh musik instrumental lembut</w:t>
+            </w:r>
+          </w:p>
+        </w:tc>
+        <w:tc>
+          <w:tcPr>
+            <w:tcW w:type="dxa" w:w="2646"/>
+            <w:shd w:val="clear" w:fill="F1F4FB"/>
+          </w:tcPr>
+          <w:p>
+            <w:pPr>
+              <w:spacing w:lineRule="auto" w:line="300" w:after="40"/>
+            </w:pPr>
+            <w:r>
+              <w:rPr>
+                <w:rFonts w:ascii="Cambria" w:hAnsi="Cambria" w:eastAsia="Cambria"/>
+                <w:b w:val="0"/>
+                <w:i w:val="0"/>
+                <w:sz w:val="21"/>
+              </w:rPr>
+              <w:t>Kebisingan dan gangguan suara</w:t>
+            </w:r>
+          </w:p>
+        </w:tc>
+      </w:tr>
+      <w:tr>
+        <w:trPr>
+          <w:cantSplit w:val="true"/>
+        </w:trPr>
+        <w:tc>
+          <w:tcPr>
+            <w:tcW w:type="dxa" w:w="2646"/>
+          </w:tcPr>
+          <w:p>
+            <w:pPr>
+              <w:spacing w:lineRule="auto" w:line="300" w:after="40"/>
+            </w:pPr>
+            <w:r>
+              <w:rPr>
+                <w:rFonts w:ascii="Cambria" w:hAnsi="Cambria" w:eastAsia="Cambria"/>
+                <w:b w:val="0"/>
+                <w:i w:val="0"/>
+                <w:sz w:val="21"/>
+              </w:rPr>
+              <w:t>Kinestetik</w:t>
+            </w:r>
+          </w:p>
+        </w:tc>
+        <w:tc>
+          <w:tcPr>
+            <w:tcW w:type="dxa" w:w="2646"/>
+          </w:tcPr>
+          <w:p>
+            <w:pPr>
+              <w:spacing w:lineRule="auto" w:line="300" w:after="40"/>
+            </w:pPr>
+            <w:r>
+              <w:rPr>
+                <w:rFonts w:ascii="Cambria" w:hAnsi="Cambria" w:eastAsia="Cambria"/>
+                <w:b w:val="0"/>
+                <w:i w:val="0"/>
+                <w:sz w:val="21"/>
+              </w:rPr>
+              <w:t>Ruang lapang, leluasa bergerak, meja fleksibel</w:t>
+            </w:r>
+          </w:p>
+        </w:tc>
+        <w:tc>
+          <w:tcPr>
+            <w:tcW w:type="dxa" w:w="2646"/>
+          </w:tcPr>
+          <w:p>
+            <w:pPr>
+              <w:spacing w:lineRule="auto" w:line="300" w:after="40"/>
+            </w:pPr>
+            <w:r>
+              <w:rPr>
+                <w:rFonts w:ascii="Cambria" w:hAnsi="Cambria" w:eastAsia="Cambria"/>
+                <w:b w:val="0"/>
+                <w:i w:val="0"/>
+                <w:sz w:val="21"/>
+              </w:rPr>
+              <w:t>Duduk diam dalam waktu lama</w:t>
+            </w:r>
+          </w:p>
+        </w:tc>
+      </w:tr>
+    </w:tbl>
+    <w:p>
+      <w:pPr>
+        <w:spacing w:lineRule="auto" w:line="288" w:after="180"/>
+        <w:widowControl w:val="true"/>
+      </w:pPr>
+      <w:r>
+        <w:rPr>
+          <w:rFonts w:ascii="Cambria" w:hAnsi="Cambria" w:eastAsia="Cambria"/>
+          <w:b w:val="0"/>
+          <w:i/>
+          <w:color w:val="5A6477"/>
+          <w:sz w:val="19"/>
+        </w:rPr>
+        <w:t>Sumber: Diolah penulis dari Schunk (2020).</w:t>
+      </w:r>
+    </w:p>
+    <w:p>
+      <w:pPr>
+        <w:keepNext/>
         <w:spacing w:lineRule="auto" w:line="360" w:before="220" w:after="100"/>
         <w:widowControl w:val="true"/>
         <w:pBdr>
@@ -7565,6 +8100,98 @@
           <w:sz w:val="24"/>
         </w:rPr>
         <w:t>Beberapa kiat membangun kebiasaan belajar berkelanjutan adalah memulai dari target kecil yang realistis, mengaitkan belajar dengan aktivitas rutin yang sudah ada, memberi penghargaan sederhana setelah mencapai target, mencatat kemajuan dalam jurnal belajar, serta tidak terlalu keras pada diri sendiri saat gagal dan segera memulai lagi. Konsistensi lebih penting daripada kesempurnaan dalam membangun kebiasaan.</w:t>
+      </w:r>
+    </w:p>
+    <w:p>
+      <w:pPr>
+        <w:spacing w:lineRule="auto" w:line="360" w:after="160" w:before="0"/>
+        <w:jc w:val="both"/>
+        <w:widowControl w:val="true"/>
+      </w:pPr>
+      <w:r>
+        <w:rPr>
+          <w:rFonts w:ascii="Cambria" w:hAnsi="Cambria" w:eastAsia="Cambria"/>
+          <w:b w:val="0"/>
+          <w:i w:val="0"/>
+          <w:sz w:val="24"/>
+        </w:rPr>
+        <w:t>Langkah membangun kebiasaan belajar tersebut dapat digambarkan sebagai satu rangkaian yang berkesinambungan, seperti tampak pada Gambar 3.2.</w:t>
+      </w:r>
+    </w:p>
+    <w:p>
+      <w:pPr>
+        <w:keepNext/>
+        <w:spacing w:before="120" w:after="60"/>
+        <w:jc w:val="center"/>
+      </w:pPr>
+      <w:r>
+        <w:drawing>
+          <wp:inline xmlns:a="http://schemas.openxmlformats.org/drawingml/2006/main" xmlns:pic="http://schemas.openxmlformats.org/drawingml/2006/picture">
+            <wp:extent cx="5220000" cy="990301"/>
+            <wp:docPr id="7" name="Picture 7"/>
+            <wp:cNvGraphicFramePr>
+              <a:graphicFrameLocks noChangeAspect="1"/>
+            </wp:cNvGraphicFramePr>
+            <a:graphic>
+              <a:graphicData uri="http://schemas.openxmlformats.org/drawingml/2006/picture">
+                <pic:pic>
+                  <pic:nvPicPr>
+                    <pic:cNvPr id="0" name="fig_3_2.png"/>
+                    <pic:cNvPicPr/>
+                  </pic:nvPicPr>
+                  <pic:blipFill>
+                    <a:blip r:embed="rId19"/>
+                    <a:stretch>
+                      <a:fillRect/>
+                    </a:stretch>
+                  </pic:blipFill>
+                  <pic:spPr>
+                    <a:xfrm>
+                      <a:off x="0" y="0"/>
+                      <a:ext cx="5220000" cy="990301"/>
+                    </a:xfrm>
+                    <a:prstGeom prst="rect"/>
+                  </pic:spPr>
+                </pic:pic>
+              </a:graphicData>
+            </a:graphic>
+          </wp:inline>
+        </w:drawing>
+      </w:r>
+    </w:p>
+    <w:p>
+      <w:pPr>
+        <w:keepNext/>
+        <w:spacing w:lineRule="auto" w:line="288" w:after="40"/>
+        <w:jc w:val="center"/>
+        <w:widowControl w:val="true"/>
+      </w:pPr>
+      <w:r>
+        <w:rPr>
+          <w:rFonts w:ascii="Cambria" w:hAnsi="Cambria" w:eastAsia="Cambria"/>
+          <w:b/>
+          <w:i w:val="0"/>
+          <w:color w:val="1F3C88"/>
+          <w:sz w:val="22"/>
+        </w:rPr>
+        <w:t>Gambar 3.2  Siklus Membangun Kebiasaan Belajar</w:t>
+      </w:r>
+    </w:p>
+    <w:p>
+      <w:pPr>
+        <w:spacing w:lineRule="auto" w:line="288" w:after="180"/>
+        <w:jc w:val="center"/>
+        <w:widowControl w:val="true"/>
+      </w:pPr>
+      <w:r>
+        <w:rPr>
+          <w:rFonts w:ascii="Cambria" w:hAnsi="Cambria" w:eastAsia="Cambria"/>
+          <w:b w:val="0"/>
+          <w:i/>
+          <w:color w:val="5A6477"/>
+          <w:sz w:val="19"/>
+        </w:rPr>
+        <w:t>Sumber: Diolah penulis dari prinsip pembentukan kebiasaan (Schunk, 2020).</w:t>
       </w:r>
     </w:p>
     <w:tbl>

</xml_diff>